<commit_message>
Deployed 74ece80 with MkDocs version: 1.6.1
</commit_message>
<xml_diff>
--- a/courses/phy201/practice-exams/e3/phy201-practice-exam-3-ch-7-8-v1.docx
+++ b/courses/phy201/practice-exams/e3/phy201-practice-exam-3-ch-7-8-v1.docx
@@ -47,7 +47,7 @@
         <w:rPr>
           <w:rFonts w:ascii="Times New Roman" w:hAnsi="Times New Roman"/>
         </w:rPr>
-        <w:t> </w:t>
+        <w:t xml:space="preserve"> </w:t>
       </w:r>
     </w:p>
     <w:p>
@@ -85,22 +85,22 @@
         <w:rPr>
           <w:rFonts w:ascii="Times New Roman" w:hAnsi="Times New Roman"/>
         </w:rPr>
-        <w:t>ANSWER: ____________________________                </w:t>
-      </w:r>
-    </w:p>
-    <w:p>
-      <w:pPr>
-        <w:numPr>
-          <w:ilvl w:val="0"/>
-          <w:numId w:val="1"/>
-        </w:numPr>
-        <w:spacing w:after="0"/>
-      </w:pPr>
-      <w:r>
-        <w:rPr>
-          <w:rFonts w:ascii="Times New Roman" w:hAnsi="Times New Roman"/>
-        </w:rPr>
-        <w:t>               </w:t>
+        <w:t xml:space="preserve">ANSWER: ____________________________                </w:t>
+      </w:r>
+    </w:p>
+    <w:p>
+      <w:pPr>
+        <w:numPr>
+          <w:ilvl w:val="0"/>
+          <w:numId w:val="1"/>
+        </w:numPr>
+        <w:spacing w:after="0"/>
+      </w:pPr>
+      <w:r>
+        <w:rPr>
+          <w:rFonts w:ascii="Times New Roman" w:hAnsi="Times New Roman"/>
+        </w:rPr>
+        <w:t xml:space="preserve">               </w:t>
       </w:r>
     </w:p>
     <w:p>
@@ -138,22 +138,22 @@
         <w:rPr>
           <w:rFonts w:ascii="Times New Roman" w:hAnsi="Times New Roman"/>
         </w:rPr>
-        <w:t>ANSWER: ____________________________                </w:t>
-      </w:r>
-    </w:p>
-    <w:p>
-      <w:pPr>
-        <w:numPr>
-          <w:ilvl w:val="0"/>
-          <w:numId w:val="1"/>
-        </w:numPr>
-        <w:spacing w:after="0"/>
-      </w:pPr>
-      <w:r>
-        <w:rPr>
-          <w:rFonts w:ascii="Times New Roman" w:hAnsi="Times New Roman"/>
-        </w:rPr>
-        <w:t>               </w:t>
+        <w:t xml:space="preserve">ANSWER: ____________________________                </w:t>
+      </w:r>
+    </w:p>
+    <w:p>
+      <w:pPr>
+        <w:numPr>
+          <w:ilvl w:val="0"/>
+          <w:numId w:val="1"/>
+        </w:numPr>
+        <w:spacing w:after="0"/>
+      </w:pPr>
+      <w:r>
+        <w:rPr>
+          <w:rFonts w:ascii="Times New Roman" w:hAnsi="Times New Roman"/>
+        </w:rPr>
+        <w:t xml:space="preserve">               </w:t>
       </w:r>
     </w:p>
     <w:p>
@@ -191,22 +191,22 @@
         <w:rPr>
           <w:rFonts w:ascii="Times New Roman" w:hAnsi="Times New Roman"/>
         </w:rPr>
-        <w:t>ANSWER: ____________________________                </w:t>
-      </w:r>
-    </w:p>
-    <w:p>
-      <w:pPr>
-        <w:numPr>
-          <w:ilvl w:val="0"/>
-          <w:numId w:val="1"/>
-        </w:numPr>
-        <w:spacing w:after="0"/>
-      </w:pPr>
-      <w:r>
-        <w:rPr>
-          <w:rFonts w:ascii="Times New Roman" w:hAnsi="Times New Roman"/>
-        </w:rPr>
-        <w:t>               </w:t>
+        <w:t xml:space="preserve">ANSWER: ____________________________                </w:t>
+      </w:r>
+    </w:p>
+    <w:p>
+      <w:pPr>
+        <w:numPr>
+          <w:ilvl w:val="0"/>
+          <w:numId w:val="1"/>
+        </w:numPr>
+        <w:spacing w:after="0"/>
+      </w:pPr>
+      <w:r>
+        <w:rPr>
+          <w:rFonts w:ascii="Times New Roman" w:hAnsi="Times New Roman"/>
+        </w:rPr>
+        <w:t xml:space="preserve">               </w:t>
       </w:r>
     </w:p>
     <w:p>
@@ -244,22 +244,22 @@
         <w:rPr>
           <w:rFonts w:ascii="Times New Roman" w:hAnsi="Times New Roman"/>
         </w:rPr>
-        <w:t>ANSWER: ____________________________                </w:t>
-      </w:r>
-    </w:p>
-    <w:p>
-      <w:pPr>
-        <w:numPr>
-          <w:ilvl w:val="0"/>
-          <w:numId w:val="1"/>
-        </w:numPr>
-        <w:spacing w:after="0"/>
-      </w:pPr>
-      <w:r>
-        <w:rPr>
-          <w:rFonts w:ascii="Times New Roman" w:hAnsi="Times New Roman"/>
-        </w:rPr>
-        <w:t>               </w:t>
+        <w:t xml:space="preserve">ANSWER: ____________________________                </w:t>
+      </w:r>
+    </w:p>
+    <w:p>
+      <w:pPr>
+        <w:numPr>
+          <w:ilvl w:val="0"/>
+          <w:numId w:val="1"/>
+        </w:numPr>
+        <w:spacing w:after="0"/>
+      </w:pPr>
+      <w:r>
+        <w:rPr>
+          <w:rFonts w:ascii="Times New Roman" w:hAnsi="Times New Roman"/>
+        </w:rPr>
+        <w:t xml:space="preserve">               </w:t>
       </w:r>
     </w:p>
     <w:p>
@@ -297,22 +297,22 @@
         <w:rPr>
           <w:rFonts w:ascii="Times New Roman" w:hAnsi="Times New Roman"/>
         </w:rPr>
-        <w:t>ANSWER: ____________________________                </w:t>
-      </w:r>
-    </w:p>
-    <w:p>
-      <w:pPr>
-        <w:numPr>
-          <w:ilvl w:val="0"/>
-          <w:numId w:val="1"/>
-        </w:numPr>
-        <w:spacing w:after="0"/>
-      </w:pPr>
-      <w:r>
-        <w:rPr>
-          <w:rFonts w:ascii="Times New Roman" w:hAnsi="Times New Roman"/>
-        </w:rPr>
-        <w:t>               </w:t>
+        <w:t xml:space="preserve">ANSWER: ____________________________                </w:t>
+      </w:r>
+    </w:p>
+    <w:p>
+      <w:pPr>
+        <w:numPr>
+          <w:ilvl w:val="0"/>
+          <w:numId w:val="1"/>
+        </w:numPr>
+        <w:spacing w:after="0"/>
+      </w:pPr>
+      <w:r>
+        <w:rPr>
+          <w:rFonts w:ascii="Times New Roman" w:hAnsi="Times New Roman"/>
+        </w:rPr>
+        <w:t xml:space="preserve">               </w:t>
       </w:r>
     </w:p>
     <w:p>
@@ -350,22 +350,22 @@
         <w:rPr>
           <w:rFonts w:ascii="Times New Roman" w:hAnsi="Times New Roman"/>
         </w:rPr>
-        <w:t>ANSWER: ____________________________                </w:t>
-      </w:r>
-    </w:p>
-    <w:p>
-      <w:pPr>
-        <w:numPr>
-          <w:ilvl w:val="0"/>
-          <w:numId w:val="1"/>
-        </w:numPr>
-        <w:spacing w:after="0"/>
-      </w:pPr>
-      <w:r>
-        <w:rPr>
-          <w:rFonts w:ascii="Times New Roman" w:hAnsi="Times New Roman"/>
-        </w:rPr>
-        <w:t>               </w:t>
+        <w:t xml:space="preserve">ANSWER: ____________________________                </w:t>
+      </w:r>
+    </w:p>
+    <w:p>
+      <w:pPr>
+        <w:numPr>
+          <w:ilvl w:val="0"/>
+          <w:numId w:val="1"/>
+        </w:numPr>
+        <w:spacing w:after="0"/>
+      </w:pPr>
+      <w:r>
+        <w:rPr>
+          <w:rFonts w:ascii="Times New Roman" w:hAnsi="Times New Roman"/>
+        </w:rPr>
+        <w:t xml:space="preserve">               </w:t>
       </w:r>
     </w:p>
     <w:p>
@@ -403,22 +403,22 @@
         <w:rPr>
           <w:rFonts w:ascii="Times New Roman" w:hAnsi="Times New Roman"/>
         </w:rPr>
-        <w:t>ANSWER: ____________________________                </w:t>
-      </w:r>
-    </w:p>
-    <w:p>
-      <w:pPr>
-        <w:numPr>
-          <w:ilvl w:val="0"/>
-          <w:numId w:val="1"/>
-        </w:numPr>
-        <w:spacing w:after="0"/>
-      </w:pPr>
-      <w:r>
-        <w:rPr>
-          <w:rFonts w:ascii="Times New Roman" w:hAnsi="Times New Roman"/>
-        </w:rPr>
-        <w:t>               </w:t>
+        <w:t xml:space="preserve">ANSWER: ____________________________                </w:t>
+      </w:r>
+    </w:p>
+    <w:p>
+      <w:pPr>
+        <w:numPr>
+          <w:ilvl w:val="0"/>
+          <w:numId w:val="1"/>
+        </w:numPr>
+        <w:spacing w:after="0"/>
+      </w:pPr>
+      <w:r>
+        <w:rPr>
+          <w:rFonts w:ascii="Times New Roman" w:hAnsi="Times New Roman"/>
+        </w:rPr>
+        <w:t xml:space="preserve">               </w:t>
       </w:r>
     </w:p>
     <w:p>
@@ -456,22 +456,22 @@
         <w:rPr>
           <w:rFonts w:ascii="Times New Roman" w:hAnsi="Times New Roman"/>
         </w:rPr>
-        <w:t>ANSWER: ____________________________                </w:t>
-      </w:r>
-    </w:p>
-    <w:p>
-      <w:pPr>
-        <w:numPr>
-          <w:ilvl w:val="0"/>
-          <w:numId w:val="1"/>
-        </w:numPr>
-        <w:spacing w:after="0"/>
-      </w:pPr>
-      <w:r>
-        <w:rPr>
-          <w:rFonts w:ascii="Times New Roman" w:hAnsi="Times New Roman"/>
-        </w:rPr>
-        <w:t>               </w:t>
+        <w:t xml:space="preserve">ANSWER: ____________________________                </w:t>
+      </w:r>
+    </w:p>
+    <w:p>
+      <w:pPr>
+        <w:numPr>
+          <w:ilvl w:val="0"/>
+          <w:numId w:val="1"/>
+        </w:numPr>
+        <w:spacing w:after="0"/>
+      </w:pPr>
+      <w:r>
+        <w:rPr>
+          <w:rFonts w:ascii="Times New Roman" w:hAnsi="Times New Roman"/>
+        </w:rPr>
+        <w:t xml:space="preserve">               </w:t>
       </w:r>
     </w:p>
     <w:p>
@@ -509,35 +509,34 @@
         <w:rPr>
           <w:rFonts w:ascii="Times New Roman" w:hAnsi="Times New Roman"/>
         </w:rPr>
-        <w:t>ANSWER: ____________________________                </w:t>
-      </w:r>
-    </w:p>
-    <w:p>
-      <w:pPr>
-        <w:numPr>
-          <w:ilvl w:val="0"/>
-          <w:numId w:val="1"/>
-        </w:numPr>
-        <w:spacing w:after="0"/>
-      </w:pPr>
-      <w:r>
-        <w:rPr>
-          <w:rFonts w:ascii="Times New Roman" w:hAnsi="Times New Roman"/>
-        </w:rPr>
-        <w:t>               </w:t>
-      </w:r>
-    </w:p>
-    <w:p>
-      <w:pPr>
-        <w:rPr>
-          <w:rFonts w:ascii="Times New Roman" w:hAnsi="Times New Roman"/>
-        </w:rPr>
-      </w:pPr>
-      <w:r>
-        <w:rPr>
-          <w:rFonts w:ascii="Times New Roman" w:hAnsi="Times New Roman"/>
-        </w:rPr>
-        <w:br w:type="page"/>
+        <w:t xml:space="preserve">ANSWER: ____________________________                </w:t>
+      </w:r>
+    </w:p>
+    <w:p>
+      <w:pPr>
+        <w:numPr>
+          <w:ilvl w:val="0"/>
+          <w:numId w:val="1"/>
+        </w:numPr>
+        <w:spacing w:after="0"/>
+      </w:pPr>
+      <w:r>
+        <w:rPr>
+          <w:rFonts w:ascii="Times New Roman" w:hAnsi="Times New Roman"/>
+        </w:rPr>
+        <w:t xml:space="preserve">               </w:t>
+      </w:r>
+    </w:p>
+    <w:p>
+      <w:pPr>
+        <w:rPr>
+          <w:rFonts w:ascii="Times New Roman" w:hAnsi="Times New Roman"/>
+        </w:rPr>
+      </w:pPr>
+      <w:r>
+        <w:rPr>
+          <w:rFonts w:ascii="Times New Roman" w:hAnsi="Times New Roman"/>
+        </w:rPr>
       </w:r>
     </w:p>
     <w:p>
@@ -552,7 +551,6 @@
         <w:rPr>
           <w:rFonts w:ascii="Times New Roman" w:hAnsi="Times New Roman"/>
         </w:rPr>
-        <w:lastRenderedPageBreak/>
         <w:t>Nicholas pushes a lawn mower, exerting a constant force of 56 N at an angle of 20</w:t>
       </w:r>
       <m:oMath>
@@ -612,22 +610,22 @@
         <w:rPr>
           <w:rFonts w:ascii="Times New Roman" w:hAnsi="Times New Roman"/>
         </w:rPr>
-        <w:t>ANSWER: ____________________________                </w:t>
-      </w:r>
-    </w:p>
-    <w:p>
-      <w:pPr>
-        <w:numPr>
-          <w:ilvl w:val="0"/>
-          <w:numId w:val="1"/>
-        </w:numPr>
-        <w:spacing w:after="0"/>
-      </w:pPr>
-      <w:r>
-        <w:rPr>
-          <w:rFonts w:ascii="Times New Roman" w:hAnsi="Times New Roman"/>
-        </w:rPr>
-        <w:t>               </w:t>
+        <w:t xml:space="preserve">ANSWER: ____________________________                </w:t>
+      </w:r>
+    </w:p>
+    <w:p>
+      <w:pPr>
+        <w:numPr>
+          <w:ilvl w:val="0"/>
+          <w:numId w:val="1"/>
+        </w:numPr>
+        <w:spacing w:after="0"/>
+      </w:pPr>
+      <w:r>
+        <w:rPr>
+          <w:rFonts w:ascii="Times New Roman" w:hAnsi="Times New Roman"/>
+        </w:rPr>
+        <w:t xml:space="preserve">               </w:t>
       </w:r>
     </w:p>
     <w:p>
@@ -665,22 +663,22 @@
         <w:rPr>
           <w:rFonts w:ascii="Times New Roman" w:hAnsi="Times New Roman"/>
         </w:rPr>
-        <w:t>ANSWER: ____________________________                </w:t>
-      </w:r>
-    </w:p>
-    <w:p>
-      <w:pPr>
-        <w:numPr>
-          <w:ilvl w:val="0"/>
-          <w:numId w:val="1"/>
-        </w:numPr>
-        <w:spacing w:after="0"/>
-      </w:pPr>
-      <w:r>
-        <w:rPr>
-          <w:rFonts w:ascii="Times New Roman" w:hAnsi="Times New Roman"/>
-        </w:rPr>
-        <w:t>               </w:t>
+        <w:t xml:space="preserve">ANSWER: ____________________________                </w:t>
+      </w:r>
+    </w:p>
+    <w:p>
+      <w:pPr>
+        <w:numPr>
+          <w:ilvl w:val="0"/>
+          <w:numId w:val="1"/>
+        </w:numPr>
+        <w:spacing w:after="0"/>
+      </w:pPr>
+      <w:r>
+        <w:rPr>
+          <w:rFonts w:ascii="Times New Roman" w:hAnsi="Times New Roman"/>
+        </w:rPr>
+        <w:t xml:space="preserve">               </w:t>
       </w:r>
     </w:p>
     <w:p>
@@ -718,22 +716,22 @@
         <w:rPr>
           <w:rFonts w:ascii="Times New Roman" w:hAnsi="Times New Roman"/>
         </w:rPr>
-        <w:t>ANSWER: ____________________________                </w:t>
-      </w:r>
-    </w:p>
-    <w:p>
-      <w:pPr>
-        <w:numPr>
-          <w:ilvl w:val="0"/>
-          <w:numId w:val="1"/>
-        </w:numPr>
-        <w:spacing w:after="0"/>
-      </w:pPr>
-      <w:r>
-        <w:rPr>
-          <w:rFonts w:ascii="Times New Roman" w:hAnsi="Times New Roman"/>
-        </w:rPr>
-        <w:t>               </w:t>
+        <w:t xml:space="preserve">ANSWER: ____________________________                </w:t>
+      </w:r>
+    </w:p>
+    <w:p>
+      <w:pPr>
+        <w:numPr>
+          <w:ilvl w:val="0"/>
+          <w:numId w:val="1"/>
+        </w:numPr>
+        <w:spacing w:after="0"/>
+      </w:pPr>
+      <w:r>
+        <w:rPr>
+          <w:rFonts w:ascii="Times New Roman" w:hAnsi="Times New Roman"/>
+        </w:rPr>
+        <w:t xml:space="preserve">               </w:t>
       </w:r>
     </w:p>
     <w:p>
@@ -771,22 +769,22 @@
         <w:rPr>
           <w:rFonts w:ascii="Times New Roman" w:hAnsi="Times New Roman"/>
         </w:rPr>
-        <w:t>ANSWER: ____________________________                </w:t>
-      </w:r>
-    </w:p>
-    <w:p>
-      <w:pPr>
-        <w:numPr>
-          <w:ilvl w:val="0"/>
-          <w:numId w:val="1"/>
-        </w:numPr>
-        <w:spacing w:after="0"/>
-      </w:pPr>
-      <w:r>
-        <w:rPr>
-          <w:rFonts w:ascii="Times New Roman" w:hAnsi="Times New Roman"/>
-        </w:rPr>
-        <w:t>               </w:t>
+        <w:t xml:space="preserve">ANSWER: ____________________________                </w:t>
+      </w:r>
+    </w:p>
+    <w:p>
+      <w:pPr>
+        <w:numPr>
+          <w:ilvl w:val="0"/>
+          <w:numId w:val="1"/>
+        </w:numPr>
+        <w:spacing w:after="0"/>
+      </w:pPr>
+      <w:r>
+        <w:rPr>
+          <w:rFonts w:ascii="Times New Roman" w:hAnsi="Times New Roman"/>
+        </w:rPr>
+        <w:t xml:space="preserve">               </w:t>
       </w:r>
     </w:p>
     <w:p>
@@ -824,22 +822,22 @@
         <w:rPr>
           <w:rFonts w:ascii="Times New Roman" w:hAnsi="Times New Roman"/>
         </w:rPr>
-        <w:t>ANSWER: ____________________________                </w:t>
-      </w:r>
-    </w:p>
-    <w:p>
-      <w:pPr>
-        <w:numPr>
-          <w:ilvl w:val="0"/>
-          <w:numId w:val="1"/>
-        </w:numPr>
-        <w:spacing w:after="0"/>
-      </w:pPr>
-      <w:r>
-        <w:rPr>
-          <w:rFonts w:ascii="Times New Roman" w:hAnsi="Times New Roman"/>
-        </w:rPr>
-        <w:t>               </w:t>
+        <w:t xml:space="preserve">ANSWER: ____________________________                </w:t>
+      </w:r>
+    </w:p>
+    <w:p>
+      <w:pPr>
+        <w:numPr>
+          <w:ilvl w:val="0"/>
+          <w:numId w:val="1"/>
+        </w:numPr>
+        <w:spacing w:after="0"/>
+      </w:pPr>
+      <w:r>
+        <w:rPr>
+          <w:rFonts w:ascii="Times New Roman" w:hAnsi="Times New Roman"/>
+        </w:rPr>
+        <w:t xml:space="preserve">               </w:t>
       </w:r>
     </w:p>
     <w:p>
@@ -877,22 +875,22 @@
         <w:rPr>
           <w:rFonts w:ascii="Times New Roman" w:hAnsi="Times New Roman"/>
         </w:rPr>
-        <w:t>ANSWER: ____________________________                </w:t>
-      </w:r>
-    </w:p>
-    <w:p>
-      <w:pPr>
-        <w:numPr>
-          <w:ilvl w:val="0"/>
-          <w:numId w:val="1"/>
-        </w:numPr>
-        <w:spacing w:after="0"/>
-      </w:pPr>
-      <w:r>
-        <w:rPr>
-          <w:rFonts w:ascii="Times New Roman" w:hAnsi="Times New Roman"/>
-        </w:rPr>
-        <w:t>               </w:t>
+        <w:t xml:space="preserve">ANSWER: ____________________________                </w:t>
+      </w:r>
+    </w:p>
+    <w:p>
+      <w:pPr>
+        <w:numPr>
+          <w:ilvl w:val="0"/>
+          <w:numId w:val="1"/>
+        </w:numPr>
+        <w:spacing w:after="0"/>
+      </w:pPr>
+      <w:r>
+        <w:rPr>
+          <w:rFonts w:ascii="Times New Roman" w:hAnsi="Times New Roman"/>
+        </w:rPr>
+        <w:t xml:space="preserve">               </w:t>
       </w:r>
     </w:p>
     <w:p>
@@ -930,22 +928,22 @@
         <w:rPr>
           <w:rFonts w:ascii="Times New Roman" w:hAnsi="Times New Roman"/>
         </w:rPr>
-        <w:t>ANSWER: ____________________________                </w:t>
-      </w:r>
-    </w:p>
-    <w:p>
-      <w:pPr>
-        <w:numPr>
-          <w:ilvl w:val="0"/>
-          <w:numId w:val="1"/>
-        </w:numPr>
-        <w:spacing w:after="0"/>
-      </w:pPr>
-      <w:r>
-        <w:rPr>
-          <w:rFonts w:ascii="Times New Roman" w:hAnsi="Times New Roman"/>
-        </w:rPr>
-        <w:t>               </w:t>
+        <w:t xml:space="preserve">ANSWER: ____________________________                </w:t>
+      </w:r>
+    </w:p>
+    <w:p>
+      <w:pPr>
+        <w:numPr>
+          <w:ilvl w:val="0"/>
+          <w:numId w:val="1"/>
+        </w:numPr>
+        <w:spacing w:after="0"/>
+      </w:pPr>
+      <w:r>
+        <w:rPr>
+          <w:rFonts w:ascii="Times New Roman" w:hAnsi="Times New Roman"/>
+        </w:rPr>
+        <w:t xml:space="preserve">               </w:t>
       </w:r>
     </w:p>
     <w:p>
@@ -983,22 +981,22 @@
         <w:rPr>
           <w:rFonts w:ascii="Times New Roman" w:hAnsi="Times New Roman"/>
         </w:rPr>
-        <w:t>ANSWER: ____________________________                </w:t>
-      </w:r>
-    </w:p>
-    <w:p>
-      <w:pPr>
-        <w:numPr>
-          <w:ilvl w:val="0"/>
-          <w:numId w:val="1"/>
-        </w:numPr>
-        <w:spacing w:after="0"/>
-      </w:pPr>
-      <w:r>
-        <w:rPr>
-          <w:rFonts w:ascii="Times New Roman" w:hAnsi="Times New Roman"/>
-        </w:rPr>
-        <w:t>               </w:t>
+        <w:t xml:space="preserve">ANSWER: ____________________________                </w:t>
+      </w:r>
+    </w:p>
+    <w:p>
+      <w:pPr>
+        <w:numPr>
+          <w:ilvl w:val="0"/>
+          <w:numId w:val="1"/>
+        </w:numPr>
+        <w:spacing w:after="0"/>
+      </w:pPr>
+      <w:r>
+        <w:rPr>
+          <w:rFonts w:ascii="Times New Roman" w:hAnsi="Times New Roman"/>
+        </w:rPr>
+        <w:t xml:space="preserve">               </w:t>
       </w:r>
     </w:p>
     <w:p>
@@ -1072,22 +1070,22 @@
         <w:rPr>
           <w:rFonts w:ascii="Times New Roman" w:hAnsi="Times New Roman"/>
         </w:rPr>
-        <w:t>ANSWER: ____________________________                </w:t>
-      </w:r>
-    </w:p>
-    <w:p>
-      <w:pPr>
-        <w:numPr>
-          <w:ilvl w:val="0"/>
-          <w:numId w:val="1"/>
-        </w:numPr>
-        <w:spacing w:after="0"/>
-      </w:pPr>
-      <w:r>
-        <w:rPr>
-          <w:rFonts w:ascii="Times New Roman" w:hAnsi="Times New Roman"/>
-        </w:rPr>
-        <w:t>               </w:t>
+        <w:t xml:space="preserve">ANSWER: ____________________________                </w:t>
+      </w:r>
+    </w:p>
+    <w:p>
+      <w:pPr>
+        <w:numPr>
+          <w:ilvl w:val="0"/>
+          <w:numId w:val="1"/>
+        </w:numPr>
+        <w:spacing w:after="0"/>
+      </w:pPr>
+      <w:r>
+        <w:rPr>
+          <w:rFonts w:ascii="Times New Roman" w:hAnsi="Times New Roman"/>
+        </w:rPr>
+        <w:t xml:space="preserve">               </w:t>
       </w:r>
     </w:p>
     <w:p>
@@ -1197,22 +1195,22 @@
         <w:rPr>
           <w:rFonts w:ascii="Times New Roman" w:hAnsi="Times New Roman"/>
         </w:rPr>
-        <w:t>ANSWER: ____________________________                </w:t>
-      </w:r>
-    </w:p>
-    <w:p>
-      <w:pPr>
-        <w:numPr>
-          <w:ilvl w:val="0"/>
-          <w:numId w:val="1"/>
-        </w:numPr>
-        <w:spacing w:after="0"/>
-      </w:pPr>
-      <w:r>
-        <w:rPr>
-          <w:rFonts w:ascii="Times New Roman" w:hAnsi="Times New Roman"/>
-        </w:rPr>
-        <w:t>               </w:t>
+        <w:t xml:space="preserve">ANSWER: ____________________________                </w:t>
+      </w:r>
+    </w:p>
+    <w:p>
+      <w:pPr>
+        <w:numPr>
+          <w:ilvl w:val="0"/>
+          <w:numId w:val="1"/>
+        </w:numPr>
+        <w:spacing w:after="0"/>
+      </w:pPr>
+      <w:r>
+        <w:rPr>
+          <w:rFonts w:ascii="Times New Roman" w:hAnsi="Times New Roman"/>
+        </w:rPr>
+        <w:t xml:space="preserve">               </w:t>
       </w:r>
     </w:p>
     <w:p>
@@ -1250,23 +1248,22 @@
         <w:rPr>
           <w:rFonts w:ascii="Times New Roman" w:hAnsi="Times New Roman"/>
         </w:rPr>
-        <w:t>ANSWER: ____________________________                </w:t>
-      </w:r>
-    </w:p>
-    <w:p>
-      <w:pPr>
-        <w:numPr>
-          <w:ilvl w:val="0"/>
-          <w:numId w:val="1"/>
-        </w:numPr>
-        <w:spacing w:after="0"/>
-      </w:pPr>
-      <w:r>
-        <w:rPr>
-          <w:rFonts w:ascii="Times New Roman" w:hAnsi="Times New Roman"/>
-        </w:rPr>
-        <w:lastRenderedPageBreak/>
-        <w:t>               </w:t>
+        <w:t xml:space="preserve">ANSWER: ____________________________                </w:t>
+      </w:r>
+    </w:p>
+    <w:p>
+      <w:pPr>
+        <w:numPr>
+          <w:ilvl w:val="0"/>
+          <w:numId w:val="1"/>
+        </w:numPr>
+        <w:spacing w:after="0"/>
+      </w:pPr>
+      <w:r>
+        <w:rPr>
+          <w:rFonts w:ascii="Times New Roman" w:hAnsi="Times New Roman"/>
+        </w:rPr>
+        <w:t xml:space="preserve">               </w:t>
       </w:r>
     </w:p>
     <w:p>
@@ -1304,22 +1301,22 @@
         <w:rPr>
           <w:rFonts w:ascii="Times New Roman" w:hAnsi="Times New Roman"/>
         </w:rPr>
-        <w:t>ANSWER: ____________________________                </w:t>
-      </w:r>
-    </w:p>
-    <w:p>
-      <w:pPr>
-        <w:numPr>
-          <w:ilvl w:val="0"/>
-          <w:numId w:val="1"/>
-        </w:numPr>
-        <w:spacing w:after="0"/>
-      </w:pPr>
-      <w:r>
-        <w:rPr>
-          <w:rFonts w:ascii="Times New Roman" w:hAnsi="Times New Roman"/>
-        </w:rPr>
-        <w:t>               </w:t>
+        <w:t xml:space="preserve">ANSWER: ____________________________                </w:t>
+      </w:r>
+    </w:p>
+    <w:p>
+      <w:pPr>
+        <w:numPr>
+          <w:ilvl w:val="0"/>
+          <w:numId w:val="1"/>
+        </w:numPr>
+        <w:spacing w:after="0"/>
+      </w:pPr>
+      <w:r>
+        <w:rPr>
+          <w:rFonts w:ascii="Times New Roman" w:hAnsi="Times New Roman"/>
+        </w:rPr>
+        <w:t xml:space="preserve">               </w:t>
       </w:r>
     </w:p>
     <w:p>
@@ -1357,22 +1354,22 @@
         <w:rPr>
           <w:rFonts w:ascii="Times New Roman" w:hAnsi="Times New Roman"/>
         </w:rPr>
-        <w:t>ANSWER: ____________________________                </w:t>
-      </w:r>
-    </w:p>
-    <w:p>
-      <w:pPr>
-        <w:numPr>
-          <w:ilvl w:val="0"/>
-          <w:numId w:val="1"/>
-        </w:numPr>
-        <w:spacing w:after="0"/>
-      </w:pPr>
-      <w:r>
-        <w:rPr>
-          <w:rFonts w:ascii="Times New Roman" w:hAnsi="Times New Roman"/>
-        </w:rPr>
-        <w:t>               </w:t>
+        <w:t xml:space="preserve">ANSWER: ____________________________                </w:t>
+      </w:r>
+    </w:p>
+    <w:p>
+      <w:pPr>
+        <w:numPr>
+          <w:ilvl w:val="0"/>
+          <w:numId w:val="1"/>
+        </w:numPr>
+        <w:spacing w:after="0"/>
+      </w:pPr>
+      <w:r>
+        <w:rPr>
+          <w:rFonts w:ascii="Times New Roman" w:hAnsi="Times New Roman"/>
+        </w:rPr>
+        <w:t xml:space="preserve">               </w:t>
       </w:r>
     </w:p>
     <w:p>
@@ -1410,22 +1407,22 @@
         <w:rPr>
           <w:rFonts w:ascii="Times New Roman" w:hAnsi="Times New Roman"/>
         </w:rPr>
-        <w:t>ANSWER: ____________________________                </w:t>
-      </w:r>
-    </w:p>
-    <w:p>
-      <w:pPr>
-        <w:numPr>
-          <w:ilvl w:val="0"/>
-          <w:numId w:val="1"/>
-        </w:numPr>
-        <w:spacing w:after="0"/>
-      </w:pPr>
-      <w:r>
-        <w:rPr>
-          <w:rFonts w:ascii="Times New Roman" w:hAnsi="Times New Roman"/>
-        </w:rPr>
-        <w:t>               </w:t>
+        <w:t xml:space="preserve">ANSWER: ____________________________                </w:t>
+      </w:r>
+    </w:p>
+    <w:p>
+      <w:pPr>
+        <w:numPr>
+          <w:ilvl w:val="0"/>
+          <w:numId w:val="1"/>
+        </w:numPr>
+        <w:spacing w:after="0"/>
+      </w:pPr>
+      <w:r>
+        <w:rPr>
+          <w:rFonts w:ascii="Times New Roman" w:hAnsi="Times New Roman"/>
+        </w:rPr>
+        <w:t xml:space="preserve">               </w:t>
       </w:r>
     </w:p>
     <w:p>
@@ -1463,22 +1460,22 @@
         <w:rPr>
           <w:rFonts w:ascii="Times New Roman" w:hAnsi="Times New Roman"/>
         </w:rPr>
-        <w:t>ANSWER: ____________________________                </w:t>
-      </w:r>
-    </w:p>
-    <w:p>
-      <w:pPr>
-        <w:numPr>
-          <w:ilvl w:val="0"/>
-          <w:numId w:val="1"/>
-        </w:numPr>
-        <w:spacing w:after="0"/>
-      </w:pPr>
-      <w:r>
-        <w:rPr>
-          <w:rFonts w:ascii="Times New Roman" w:hAnsi="Times New Roman"/>
-        </w:rPr>
-        <w:t>               </w:t>
+        <w:t xml:space="preserve">ANSWER: ____________________________                </w:t>
+      </w:r>
+    </w:p>
+    <w:p>
+      <w:pPr>
+        <w:numPr>
+          <w:ilvl w:val="0"/>
+          <w:numId w:val="1"/>
+        </w:numPr>
+        <w:spacing w:after="0"/>
+      </w:pPr>
+      <w:r>
+        <w:rPr>
+          <w:rFonts w:ascii="Times New Roman" w:hAnsi="Times New Roman"/>
+        </w:rPr>
+        <w:t xml:space="preserve">               </w:t>
       </w:r>
     </w:p>
     <w:p>
@@ -1516,22 +1513,22 @@
         <w:rPr>
           <w:rFonts w:ascii="Times New Roman" w:hAnsi="Times New Roman"/>
         </w:rPr>
-        <w:t>ANSWER: ____________________________                </w:t>
-      </w:r>
-    </w:p>
-    <w:p>
-      <w:pPr>
-        <w:numPr>
-          <w:ilvl w:val="0"/>
-          <w:numId w:val="1"/>
-        </w:numPr>
-        <w:spacing w:after="0"/>
-      </w:pPr>
-      <w:r>
-        <w:rPr>
-          <w:rFonts w:ascii="Times New Roman" w:hAnsi="Times New Roman"/>
-        </w:rPr>
-        <w:t>               </w:t>
+        <w:t xml:space="preserve">ANSWER: ____________________________                </w:t>
+      </w:r>
+    </w:p>
+    <w:p>
+      <w:pPr>
+        <w:numPr>
+          <w:ilvl w:val="0"/>
+          <w:numId w:val="1"/>
+        </w:numPr>
+        <w:spacing w:after="0"/>
+      </w:pPr>
+      <w:r>
+        <w:rPr>
+          <w:rFonts w:ascii="Times New Roman" w:hAnsi="Times New Roman"/>
+        </w:rPr>
+        <w:t xml:space="preserve">               </w:t>
       </w:r>
     </w:p>
     <w:p>
@@ -1602,22 +1599,22 @@
         <w:rPr>
           <w:rFonts w:ascii="Times New Roman" w:hAnsi="Times New Roman"/>
         </w:rPr>
-        <w:t>ANSWER: ____________________________                </w:t>
-      </w:r>
-    </w:p>
-    <w:p>
-      <w:pPr>
-        <w:numPr>
-          <w:ilvl w:val="0"/>
-          <w:numId w:val="1"/>
-        </w:numPr>
-        <w:spacing w:after="0"/>
-      </w:pPr>
-      <w:r>
-        <w:rPr>
-          <w:rFonts w:ascii="Times New Roman" w:hAnsi="Times New Roman"/>
-        </w:rPr>
-        <w:t>               </w:t>
+        <w:t xml:space="preserve">ANSWER: ____________________________                </w:t>
+      </w:r>
+    </w:p>
+    <w:p>
+      <w:pPr>
+        <w:numPr>
+          <w:ilvl w:val="0"/>
+          <w:numId w:val="1"/>
+        </w:numPr>
+        <w:spacing w:after="0"/>
+      </w:pPr>
+      <w:r>
+        <w:rPr>
+          <w:rFonts w:ascii="Times New Roman" w:hAnsi="Times New Roman"/>
+        </w:rPr>
+        <w:t xml:space="preserve">               </w:t>
       </w:r>
     </w:p>
     <w:p>
@@ -1655,22 +1652,22 @@
         <w:rPr>
           <w:rFonts w:ascii="Times New Roman" w:hAnsi="Times New Roman"/>
         </w:rPr>
-        <w:t>ANSWER: ____________________________                </w:t>
-      </w:r>
-    </w:p>
-    <w:p>
-      <w:pPr>
-        <w:numPr>
-          <w:ilvl w:val="0"/>
-          <w:numId w:val="1"/>
-        </w:numPr>
-        <w:spacing w:after="0"/>
-      </w:pPr>
-      <w:r>
-        <w:rPr>
-          <w:rFonts w:ascii="Times New Roman" w:hAnsi="Times New Roman"/>
-        </w:rPr>
-        <w:t>               </w:t>
+        <w:t xml:space="preserve">ANSWER: ____________________________                </w:t>
+      </w:r>
+    </w:p>
+    <w:p>
+      <w:pPr>
+        <w:numPr>
+          <w:ilvl w:val="0"/>
+          <w:numId w:val="1"/>
+        </w:numPr>
+        <w:spacing w:after="0"/>
+      </w:pPr>
+      <w:r>
+        <w:rPr>
+          <w:rFonts w:ascii="Times New Roman" w:hAnsi="Times New Roman"/>
+        </w:rPr>
+        <w:t xml:space="preserve">               </w:t>
       </w:r>
     </w:p>
     <w:p>
@@ -1744,22 +1741,22 @@
         <w:rPr>
           <w:rFonts w:ascii="Times New Roman" w:hAnsi="Times New Roman"/>
         </w:rPr>
-        <w:t>ANSWER: ____________________________                </w:t>
-      </w:r>
-    </w:p>
-    <w:p>
-      <w:pPr>
-        <w:numPr>
-          <w:ilvl w:val="0"/>
-          <w:numId w:val="1"/>
-        </w:numPr>
-        <w:spacing w:after="0"/>
-      </w:pPr>
-      <w:r>
-        <w:rPr>
-          <w:rFonts w:ascii="Times New Roman" w:hAnsi="Times New Roman"/>
-        </w:rPr>
-        <w:t>               </w:t>
+        <w:t xml:space="preserve">ANSWER: ____________________________                </w:t>
+      </w:r>
+    </w:p>
+    <w:p>
+      <w:pPr>
+        <w:numPr>
+          <w:ilvl w:val="0"/>
+          <w:numId w:val="1"/>
+        </w:numPr>
+        <w:spacing w:after="0"/>
+      </w:pPr>
+      <w:r>
+        <w:rPr>
+          <w:rFonts w:ascii="Times New Roman" w:hAnsi="Times New Roman"/>
+        </w:rPr>
+        <w:t xml:space="preserve">               </w:t>
       </w:r>
     </w:p>
     <w:p>
@@ -1797,22 +1794,22 @@
         <w:rPr>
           <w:rFonts w:ascii="Times New Roman" w:hAnsi="Times New Roman"/>
         </w:rPr>
-        <w:t>ANSWER: ____________________________                </w:t>
-      </w:r>
-    </w:p>
-    <w:p>
-      <w:pPr>
-        <w:numPr>
-          <w:ilvl w:val="0"/>
-          <w:numId w:val="1"/>
-        </w:numPr>
-        <w:spacing w:after="0"/>
-      </w:pPr>
-      <w:r>
-        <w:rPr>
-          <w:rFonts w:ascii="Times New Roman" w:hAnsi="Times New Roman"/>
-        </w:rPr>
-        <w:t>               </w:t>
+        <w:t xml:space="preserve">ANSWER: ____________________________                </w:t>
+      </w:r>
+    </w:p>
+    <w:p>
+      <w:pPr>
+        <w:numPr>
+          <w:ilvl w:val="0"/>
+          <w:numId w:val="1"/>
+        </w:numPr>
+        <w:spacing w:after="0"/>
+      </w:pPr>
+      <w:r>
+        <w:rPr>
+          <w:rFonts w:ascii="Times New Roman" w:hAnsi="Times New Roman"/>
+        </w:rPr>
+        <w:t xml:space="preserve">               </w:t>
       </w:r>
     </w:p>
     <w:p>
@@ -1850,35 +1847,34 @@
         <w:rPr>
           <w:rFonts w:ascii="Times New Roman" w:hAnsi="Times New Roman"/>
         </w:rPr>
-        <w:t>ANSWER: ____________________________                </w:t>
-      </w:r>
-    </w:p>
-    <w:p>
-      <w:pPr>
-        <w:numPr>
-          <w:ilvl w:val="0"/>
-          <w:numId w:val="1"/>
-        </w:numPr>
-        <w:spacing w:after="0"/>
-      </w:pPr>
-      <w:r>
-        <w:rPr>
-          <w:rFonts w:ascii="Times New Roman" w:hAnsi="Times New Roman"/>
-        </w:rPr>
-        <w:t>               </w:t>
-      </w:r>
-    </w:p>
-    <w:p>
-      <w:pPr>
-        <w:rPr>
-          <w:rFonts w:ascii="Times New Roman" w:hAnsi="Times New Roman"/>
-        </w:rPr>
-      </w:pPr>
-      <w:r>
-        <w:rPr>
-          <w:rFonts w:ascii="Times New Roman" w:hAnsi="Times New Roman"/>
-        </w:rPr>
-        <w:br w:type="page"/>
+        <w:t xml:space="preserve">ANSWER: ____________________________                </w:t>
+      </w:r>
+    </w:p>
+    <w:p>
+      <w:pPr>
+        <w:numPr>
+          <w:ilvl w:val="0"/>
+          <w:numId w:val="1"/>
+        </w:numPr>
+        <w:spacing w:after="0"/>
+      </w:pPr>
+      <w:r>
+        <w:rPr>
+          <w:rFonts w:ascii="Times New Roman" w:hAnsi="Times New Roman"/>
+        </w:rPr>
+        <w:t xml:space="preserve">               </w:t>
+      </w:r>
+    </w:p>
+    <w:p>
+      <w:pPr>
+        <w:rPr>
+          <w:rFonts w:ascii="Times New Roman" w:hAnsi="Times New Roman"/>
+        </w:rPr>
+      </w:pPr>
+      <w:r>
+        <w:rPr>
+          <w:rFonts w:ascii="Times New Roman" w:hAnsi="Times New Roman"/>
+        </w:rPr>
       </w:r>
     </w:p>
     <w:p>
@@ -1893,7 +1889,6 @@
         <w:rPr>
           <w:rFonts w:ascii="Times New Roman" w:hAnsi="Times New Roman"/>
         </w:rPr>
-        <w:lastRenderedPageBreak/>
         <w:t>A 0.23-kg orange box is slid eastward on a frictionless surface into a dark room, where it strikes an initially stationary purple box, which has a mass of 0.32 kg. The orange box emerges from the room at an angle of 32</w:t>
       </w:r>
       <m:oMath>
@@ -1953,22 +1948,22 @@
         <w:rPr>
           <w:rFonts w:ascii="Times New Roman" w:hAnsi="Times New Roman"/>
         </w:rPr>
-        <w:t>ANSWER: ____________________________                </w:t>
-      </w:r>
-    </w:p>
-    <w:p>
-      <w:pPr>
-        <w:numPr>
-          <w:ilvl w:val="0"/>
-          <w:numId w:val="1"/>
-        </w:numPr>
-        <w:spacing w:after="0"/>
-      </w:pPr>
-      <w:r>
-        <w:rPr>
-          <w:rFonts w:ascii="Times New Roman" w:hAnsi="Times New Roman"/>
-        </w:rPr>
-        <w:t>               </w:t>
+        <w:t xml:space="preserve">ANSWER: ____________________________                </w:t>
+      </w:r>
+    </w:p>
+    <w:p>
+      <w:pPr>
+        <w:numPr>
+          <w:ilvl w:val="0"/>
+          <w:numId w:val="1"/>
+        </w:numPr>
+        <w:spacing w:after="0"/>
+      </w:pPr>
+      <w:r>
+        <w:rPr>
+          <w:rFonts w:ascii="Times New Roman" w:hAnsi="Times New Roman"/>
+        </w:rPr>
+        <w:t xml:space="preserve">               </w:t>
       </w:r>
     </w:p>
     <w:p>
@@ -2006,22 +2001,22 @@
         <w:rPr>
           <w:rFonts w:ascii="Times New Roman" w:hAnsi="Times New Roman"/>
         </w:rPr>
-        <w:t>ANSWER: ____________________________                </w:t>
-      </w:r>
-    </w:p>
-    <w:p>
-      <w:pPr>
-        <w:numPr>
-          <w:ilvl w:val="0"/>
-          <w:numId w:val="1"/>
-        </w:numPr>
-        <w:spacing w:after="0"/>
-      </w:pPr>
-      <w:r>
-        <w:rPr>
-          <w:rFonts w:ascii="Times New Roman" w:hAnsi="Times New Roman"/>
-        </w:rPr>
-        <w:t>               </w:t>
+        <w:t xml:space="preserve">ANSWER: ____________________________                </w:t>
+      </w:r>
+    </w:p>
+    <w:p>
+      <w:pPr>
+        <w:numPr>
+          <w:ilvl w:val="0"/>
+          <w:numId w:val="1"/>
+        </w:numPr>
+        <w:spacing w:after="0"/>
+      </w:pPr>
+      <w:r>
+        <w:rPr>
+          <w:rFonts w:ascii="Times New Roman" w:hAnsi="Times New Roman"/>
+        </w:rPr>
+        <w:t xml:space="preserve">               </w:t>
       </w:r>
     </w:p>
     <w:p>
@@ -2059,22 +2054,22 @@
         <w:rPr>
           <w:rFonts w:ascii="Times New Roman" w:hAnsi="Times New Roman"/>
         </w:rPr>
-        <w:t>ANSWER: ____________________________                </w:t>
-      </w:r>
-    </w:p>
-    <w:p>
-      <w:pPr>
-        <w:numPr>
-          <w:ilvl w:val="0"/>
-          <w:numId w:val="1"/>
-        </w:numPr>
-        <w:spacing w:after="0"/>
-      </w:pPr>
-      <w:r>
-        <w:rPr>
-          <w:rFonts w:ascii="Times New Roman" w:hAnsi="Times New Roman"/>
-        </w:rPr>
-        <w:t>               </w:t>
+        <w:t xml:space="preserve">ANSWER: ____________________________                </w:t>
+      </w:r>
+    </w:p>
+    <w:p>
+      <w:pPr>
+        <w:numPr>
+          <w:ilvl w:val="0"/>
+          <w:numId w:val="1"/>
+        </w:numPr>
+        <w:spacing w:after="0"/>
+      </w:pPr>
+      <w:r>
+        <w:rPr>
+          <w:rFonts w:ascii="Times New Roman" w:hAnsi="Times New Roman"/>
+        </w:rPr>
+        <w:t xml:space="preserve">               </w:t>
       </w:r>
     </w:p>
     <w:p>
@@ -2112,22 +2107,22 @@
         <w:rPr>
           <w:rFonts w:ascii="Times New Roman" w:hAnsi="Times New Roman"/>
         </w:rPr>
-        <w:t>ANSWER: ____________________________                </w:t>
-      </w:r>
-    </w:p>
-    <w:p>
-      <w:pPr>
-        <w:numPr>
-          <w:ilvl w:val="0"/>
-          <w:numId w:val="1"/>
-        </w:numPr>
-        <w:spacing w:after="0"/>
-      </w:pPr>
-      <w:r>
-        <w:rPr>
-          <w:rFonts w:ascii="Times New Roman" w:hAnsi="Times New Roman"/>
-        </w:rPr>
-        <w:t>               </w:t>
+        <w:t xml:space="preserve">ANSWER: ____________________________                </w:t>
+      </w:r>
+    </w:p>
+    <w:p>
+      <w:pPr>
+        <w:numPr>
+          <w:ilvl w:val="0"/>
+          <w:numId w:val="1"/>
+        </w:numPr>
+        <w:spacing w:after="0"/>
+      </w:pPr>
+      <w:r>
+        <w:rPr>
+          <w:rFonts w:ascii="Times New Roman" w:hAnsi="Times New Roman"/>
+        </w:rPr>
+        <w:t xml:space="preserve">               </w:t>
       </w:r>
     </w:p>
     <w:p>
@@ -2165,22 +2160,22 @@
         <w:rPr>
           <w:rFonts w:ascii="Times New Roman" w:hAnsi="Times New Roman"/>
         </w:rPr>
-        <w:t>ANSWER: ____________________________                </w:t>
-      </w:r>
-    </w:p>
-    <w:p>
-      <w:pPr>
-        <w:numPr>
-          <w:ilvl w:val="0"/>
-          <w:numId w:val="1"/>
-        </w:numPr>
-        <w:spacing w:after="0"/>
-      </w:pPr>
-      <w:r>
-        <w:rPr>
-          <w:rFonts w:ascii="Times New Roman" w:hAnsi="Times New Roman"/>
-        </w:rPr>
-        <w:t>               </w:t>
+        <w:t xml:space="preserve">ANSWER: ____________________________                </w:t>
+      </w:r>
+    </w:p>
+    <w:p>
+      <w:pPr>
+        <w:numPr>
+          <w:ilvl w:val="0"/>
+          <w:numId w:val="1"/>
+        </w:numPr>
+        <w:spacing w:after="0"/>
+      </w:pPr>
+      <w:r>
+        <w:rPr>
+          <w:rFonts w:ascii="Times New Roman" w:hAnsi="Times New Roman"/>
+        </w:rPr>
+        <w:t xml:space="preserve">               </w:t>
       </w:r>
     </w:p>
     <w:p>
@@ -2218,22 +2213,22 @@
         <w:rPr>
           <w:rFonts w:ascii="Times New Roman" w:hAnsi="Times New Roman"/>
         </w:rPr>
-        <w:t>ANSWER: ____________________________                </w:t>
-      </w:r>
-    </w:p>
-    <w:p>
-      <w:pPr>
-        <w:numPr>
-          <w:ilvl w:val="0"/>
-          <w:numId w:val="1"/>
-        </w:numPr>
-        <w:spacing w:after="0"/>
-      </w:pPr>
-      <w:r>
-        <w:rPr>
-          <w:rFonts w:ascii="Times New Roman" w:hAnsi="Times New Roman"/>
-        </w:rPr>
-        <w:t>               </w:t>
+        <w:t xml:space="preserve">ANSWER: ____________________________                </w:t>
+      </w:r>
+    </w:p>
+    <w:p>
+      <w:pPr>
+        <w:numPr>
+          <w:ilvl w:val="0"/>
+          <w:numId w:val="1"/>
+        </w:numPr>
+        <w:spacing w:after="0"/>
+      </w:pPr>
+      <w:r>
+        <w:rPr>
+          <w:rFonts w:ascii="Times New Roman" w:hAnsi="Times New Roman"/>
+        </w:rPr>
+        <w:t xml:space="preserve">               </w:t>
       </w:r>
     </w:p>
     <w:p>
@@ -2307,22 +2302,22 @@
         <w:rPr>
           <w:rFonts w:ascii="Times New Roman" w:hAnsi="Times New Roman"/>
         </w:rPr>
-        <w:t>ANSWER: ____________________________                </w:t>
-      </w:r>
-    </w:p>
-    <w:p>
-      <w:pPr>
-        <w:numPr>
-          <w:ilvl w:val="0"/>
-          <w:numId w:val="1"/>
-        </w:numPr>
-        <w:spacing w:after="0"/>
-      </w:pPr>
-      <w:r>
-        <w:rPr>
-          <w:rFonts w:ascii="Times New Roman" w:hAnsi="Times New Roman"/>
-        </w:rPr>
-        <w:t>               </w:t>
+        <w:t xml:space="preserve">ANSWER: ____________________________                </w:t>
+      </w:r>
+    </w:p>
+    <w:p>
+      <w:pPr>
+        <w:numPr>
+          <w:ilvl w:val="0"/>
+          <w:numId w:val="1"/>
+        </w:numPr>
+        <w:spacing w:after="0"/>
+      </w:pPr>
+      <w:r>
+        <w:rPr>
+          <w:rFonts w:ascii="Times New Roman" w:hAnsi="Times New Roman"/>
+        </w:rPr>
+        <w:t xml:space="preserve">               </w:t>
       </w:r>
     </w:p>
     <w:p>
@@ -2396,22 +2391,22 @@
         <w:rPr>
           <w:rFonts w:ascii="Times New Roman" w:hAnsi="Times New Roman"/>
         </w:rPr>
-        <w:t>ANSWER: ____________________________                </w:t>
-      </w:r>
-    </w:p>
-    <w:p>
-      <w:pPr>
-        <w:numPr>
-          <w:ilvl w:val="0"/>
-          <w:numId w:val="1"/>
-        </w:numPr>
-        <w:spacing w:after="0"/>
-      </w:pPr>
-      <w:r>
-        <w:rPr>
-          <w:rFonts w:ascii="Times New Roman" w:hAnsi="Times New Roman"/>
-        </w:rPr>
-        <w:t>               </w:t>
+        <w:t xml:space="preserve">ANSWER: ____________________________                </w:t>
+      </w:r>
+    </w:p>
+    <w:p>
+      <w:pPr>
+        <w:numPr>
+          <w:ilvl w:val="0"/>
+          <w:numId w:val="1"/>
+        </w:numPr>
+        <w:spacing w:after="0"/>
+      </w:pPr>
+      <w:r>
+        <w:rPr>
+          <w:rFonts w:ascii="Times New Roman" w:hAnsi="Times New Roman"/>
+        </w:rPr>
+        <w:t xml:space="preserve">               </w:t>
       </w:r>
     </w:p>
     <w:sectPr>

</xml_diff>